<commit_message>
PHASE Z complete: HUIM-selected APs below 7 m on every dataset
HCXY: 137/347 WAPs, 1.50 m. Verification rerun over all six datasets
(402 checks, 0 failed); figures and Word report rebuilt.

Co-Authored-By: Claude Opus 5.5 <noreply@anthropic.com>
Claude-Session: https://claude.ai/code/session_01XC5TNctxsz3htoKADALTxX
</commit_message>
<xml_diff>
--- a/report/Bao_Cao_HUIM_IPS_Theo_Vung.docx
+++ b/report/Bao_Cao_HUIM_IPS_Theo_Vung.docx
@@ -80,7 +80,7 @@
           <w:sz w:val="20"/>
           <w:rFonts w:ascii="Times New Roman" w:hAnsi="Times New Roman" w:eastAsia="Times New Roman" w:cs="Times New Roman"/>
         </w:rPr>
-        <w:t>Sinh tự động lúc 2026-10-17 07:17 UTC từ results/huim_zone/</w:t>
+        <w:t>Sinh tự động lúc 2026-10-17 08:01 UTC từ results/huim_zone/</w:t>
       </w:r>
     </w:p>
     <w:p>
@@ -158,7 +158,7 @@
           <w:i w:val="0"/>
           <w:rFonts w:ascii="Times New Roman" w:hAnsi="Times New Roman" w:eastAsia="Times New Roman" w:cs="Times New Roman"/>
         </w:rPr>
-        <w:t xml:space="preserve">Kết quả trên UJIIndoorLoc (validationData  1 111 fingerprint): </w:t>
+        <w:t xml:space="preserve">Kết quả trên UJIIndoorLoc (validationData, 1 111 fingerprint): </w:t>
       </w:r>
       <w:r>
         <w:rPr>
@@ -850,6 +850,128 @@
                 <w:sz w:val="17"/>
                 <w:rFonts w:ascii="Times New Roman" w:hAnsi="Times New Roman" w:eastAsia="Times New Roman" w:cs="Times New Roman"/>
               </w:rPr>
+              <w:t>HCXY</w:t>
+            </w:r>
+          </w:p>
+        </w:tc>
+        <w:tc>
+          <w:tcPr>
+            <w:tcW w:type="dxa" w:w="1170"/>
+          </w:tcPr>
+          <w:p>
+            <w:r/>
+            <w:r>
+              <w:rPr>
+                <w:sz w:val="17"/>
+                <w:rFonts w:ascii="Times New Roman" w:hAnsi="Times New Roman" w:eastAsia="Times New Roman" w:cs="Times New Roman"/>
+              </w:rPr>
+              <w:t>test_HCXY</w:t>
+            </w:r>
+          </w:p>
+        </w:tc>
+        <w:tc>
+          <w:tcPr>
+            <w:tcW w:type="dxa" w:w="1170"/>
+          </w:tcPr>
+          <w:p>
+            <w:r/>
+            <w:r>
+              <w:rPr>
+                <w:sz w:val="17"/>
+                <w:rFonts w:ascii="Times New Roman" w:hAnsi="Times New Roman" w:eastAsia="Times New Roman" w:cs="Times New Roman"/>
+              </w:rPr>
+              <w:t>860</w:t>
+            </w:r>
+          </w:p>
+        </w:tc>
+        <w:tc>
+          <w:tcPr>
+            <w:tcW w:type="dxa" w:w="1170"/>
+          </w:tcPr>
+          <w:p>
+            <w:r/>
+            <w:r>
+              <w:rPr>
+                <w:sz w:val="17"/>
+                <w:rFonts w:ascii="Times New Roman" w:hAnsi="Times New Roman" w:eastAsia="Times New Roman" w:cs="Times New Roman"/>
+              </w:rPr>
+              <w:t>137/347</w:t>
+            </w:r>
+          </w:p>
+        </w:tc>
+        <w:tc>
+          <w:tcPr>
+            <w:tcW w:type="dxa" w:w="1170"/>
+          </w:tcPr>
+          <w:p>
+            <w:r/>
+            <w:r>
+              <w:rPr>
+                <w:sz w:val="17"/>
+                <w:rFonts w:ascii="Times New Roman" w:hAnsi="Times New Roman" w:eastAsia="Times New Roman" w:cs="Times New Roman"/>
+              </w:rPr>
+              <w:t>1,50</w:t>
+            </w:r>
+          </w:p>
+        </w:tc>
+        <w:tc>
+          <w:tcPr>
+            <w:tcW w:type="dxa" w:w="1170"/>
+          </w:tcPr>
+          <w:p>
+            <w:r/>
+            <w:r>
+              <w:rPr>
+                <w:sz w:val="17"/>
+                <w:rFonts w:ascii="Times New Roman" w:hAnsi="Times New Roman" w:eastAsia="Times New Roman" w:cs="Times New Roman"/>
+              </w:rPr>
+              <w:t>1,55</w:t>
+            </w:r>
+          </w:p>
+        </w:tc>
+        <w:tc>
+          <w:tcPr>
+            <w:tcW w:type="dxa" w:w="1170"/>
+          </w:tcPr>
+          <w:p>
+            <w:r/>
+            <w:r>
+              <w:rPr>
+                <w:sz w:val="17"/>
+                <w:rFonts w:ascii="Times New Roman" w:hAnsi="Times New Roman" w:eastAsia="Times New Roman" w:cs="Times New Roman"/>
+              </w:rPr>
+              <w:t>1,09</w:t>
+            </w:r>
+          </w:p>
+        </w:tc>
+        <w:tc>
+          <w:tcPr>
+            <w:tcW w:type="dxa" w:w="1170"/>
+          </w:tcPr>
+          <w:p>
+            <w:r/>
+            <w:r>
+              <w:rPr>
+                <w:sz w:val="17"/>
+                <w:rFonts w:ascii="Times New Roman" w:hAnsi="Times New Roman" w:eastAsia="Times New Roman" w:cs="Times New Roman"/>
+              </w:rPr>
+              <w:t>đạt</w:t>
+            </w:r>
+          </w:p>
+        </w:tc>
+      </w:tr>
+      <w:tr>
+        <w:tc>
+          <w:tcPr>
+            <w:tcW w:type="dxa" w:w="1170"/>
+          </w:tcPr>
+          <w:p>
+            <w:r/>
+            <w:r>
+              <w:rPr>
+                <w:sz w:val="17"/>
+                <w:rFonts w:ascii="Times New Roman" w:hAnsi="Times New Roman" w:eastAsia="Times New Roman" w:cs="Times New Roman"/>
+              </w:rPr>
               <w:t>HUS</w:t>
             </w:r>
           </w:p>
@@ -1335,7 +1457,7 @@
       <w:r>
         <w:drawing>
           <wp:inline xmlns:a="http://schemas.openxmlformats.org/drawingml/2006/main" xmlns:pic="http://schemas.openxmlformats.org/drawingml/2006/picture">
-            <wp:extent cx="5760720" cy="2635458"/>
+            <wp:extent cx="5760720" cy="2336157"/>
             <wp:docPr id="1" name="Picture 1"/>
             <wp:cNvGraphicFramePr>
               <a:graphicFrameLocks noChangeAspect="1"/>
@@ -1356,7 +1478,7 @@
                   <pic:spPr>
                     <a:xfrm>
                       <a:off x="0" y="0"/>
-                      <a:ext cx="5760720" cy="2635458"/>
+                      <a:ext cx="5760720" cy="2336157"/>
                     </a:xfrm>
                     <a:prstGeom prst="rect"/>
                   </pic:spPr>
@@ -7529,6 +7651,158 @@
                 <w:sz w:val="15"/>
                 <w:rFonts w:ascii="Times New Roman" w:hAnsi="Times New Roman" w:eastAsia="Times New Roman" w:cs="Times New Roman"/>
               </w:rPr>
+              <w:t>HCXY</w:t>
+            </w:r>
+          </w:p>
+        </w:tc>
+        <w:tc>
+          <w:tcPr>
+            <w:tcW w:type="dxa" w:w="936"/>
+          </w:tcPr>
+          <w:p>
+            <w:r/>
+            <w:r>
+              <w:rPr>
+                <w:sz w:val="15"/>
+                <w:rFonts w:ascii="Times New Roman" w:hAnsi="Times New Roman" w:eastAsia="Times New Roman" w:cs="Times New Roman"/>
+              </w:rPr>
+              <w:t>8</w:t>
+            </w:r>
+          </w:p>
+        </w:tc>
+        <w:tc>
+          <w:tcPr>
+            <w:tcW w:type="dxa" w:w="936"/>
+          </w:tcPr>
+          <w:p>
+            <w:r/>
+            <w:r>
+              <w:rPr>
+                <w:sz w:val="15"/>
+                <w:rFonts w:ascii="Times New Roman" w:hAnsi="Times New Roman" w:eastAsia="Times New Roman" w:cs="Times New Roman"/>
+              </w:rPr>
+              <w:t>test_HCXY</w:t>
+            </w:r>
+          </w:p>
+        </w:tc>
+        <w:tc>
+          <w:tcPr>
+            <w:tcW w:type="dxa" w:w="936"/>
+          </w:tcPr>
+          <w:p>
+            <w:r/>
+            <w:r>
+              <w:rPr>
+                <w:sz w:val="15"/>
+                <w:rFonts w:ascii="Times New Roman" w:hAnsi="Times New Roman" w:eastAsia="Times New Roman" w:cs="Times New Roman"/>
+              </w:rPr>
+              <w:t>A, θ 10%</w:t>
+            </w:r>
+          </w:p>
+        </w:tc>
+        <w:tc>
+          <w:tcPr>
+            <w:tcW w:type="dxa" w:w="936"/>
+          </w:tcPr>
+          <w:p>
+            <w:r/>
+            <w:r>
+              <w:rPr>
+                <w:sz w:val="15"/>
+                <w:rFonts w:ascii="Times New Roman" w:hAnsi="Times New Roman" w:eastAsia="Times New Roman" w:cs="Times New Roman"/>
+              </w:rPr>
+              <w:t>137/347</w:t>
+            </w:r>
+          </w:p>
+        </w:tc>
+        <w:tc>
+          <w:tcPr>
+            <w:tcW w:type="dxa" w:w="936"/>
+          </w:tcPr>
+          <w:p>
+            <w:r/>
+            <w:r>
+              <w:rPr>
+                <w:sz w:val="15"/>
+                <w:rFonts w:ascii="Times New Roman" w:hAnsi="Times New Roman" w:eastAsia="Times New Roman" w:cs="Times New Roman"/>
+              </w:rPr>
+              <w:t>1,50</w:t>
+            </w:r>
+          </w:p>
+        </w:tc>
+        <w:tc>
+          <w:tcPr>
+            <w:tcW w:type="dxa" w:w="936"/>
+          </w:tcPr>
+          <w:p>
+            <w:r/>
+            <w:r>
+              <w:rPr>
+                <w:sz w:val="15"/>
+                <w:rFonts w:ascii="Times New Roman" w:hAnsi="Times New Roman" w:eastAsia="Times New Roman" w:cs="Times New Roman"/>
+              </w:rPr>
+              <w:t>1,55</w:t>
+            </w:r>
+          </w:p>
+        </w:tc>
+        <w:tc>
+          <w:tcPr>
+            <w:tcW w:type="dxa" w:w="936"/>
+          </w:tcPr>
+          <w:p>
+            <w:r/>
+            <w:r>
+              <w:rPr>
+                <w:sz w:val="15"/>
+                <w:rFonts w:ascii="Times New Roman" w:hAnsi="Times New Roman" w:eastAsia="Times New Roman" w:cs="Times New Roman"/>
+              </w:rPr>
+              <w:t>2,12</w:t>
+            </w:r>
+          </w:p>
+        </w:tc>
+        <w:tc>
+          <w:tcPr>
+            <w:tcW w:type="dxa" w:w="936"/>
+          </w:tcPr>
+          <w:p>
+            <w:r/>
+            <w:r>
+              <w:rPr>
+                <w:sz w:val="15"/>
+                <w:rFonts w:ascii="Times New Roman" w:hAnsi="Times New Roman" w:eastAsia="Times New Roman" w:cs="Times New Roman"/>
+              </w:rPr>
+              <w:t>2,02</w:t>
+            </w:r>
+          </w:p>
+        </w:tc>
+        <w:tc>
+          <w:tcPr>
+            <w:tcW w:type="dxa" w:w="936"/>
+          </w:tcPr>
+          <w:p>
+            <w:r/>
+            <w:r>
+              <w:rPr>
+                <w:sz w:val="15"/>
+                <w:rFonts w:ascii="Times New Roman" w:hAnsi="Times New Roman" w:eastAsia="Times New Roman" w:cs="Times New Roman"/>
+              </w:rPr>
+              <w:t>100,00%</w:t>
+            </w:r>
+          </w:p>
+        </w:tc>
+      </w:tr>
+      <w:tr>
+        <w:tc>
+          <w:tcPr>
+            <w:tcW w:type="dxa" w:w="936"/>
+          </w:tcPr>
+          <w:p>
+            <w:r/>
+            <w:r>
+              <w:rPr>
+                <w:sz w:val="15"/>
+                <w:rFonts w:ascii="Times New Roman" w:hAnsi="Times New Roman" w:eastAsia="Times New Roman" w:cs="Times New Roman"/>
+              </w:rPr>
               <w:t>HUS</w:t>
             </w:r>
           </w:p>
@@ -8240,7 +8514,7 @@
           <w:sz w:val="22"/>
           <w:rFonts w:ascii="Times New Roman" w:hAnsi="Times New Roman" w:eastAsia="Times New Roman" w:cs="Times New Roman"/>
         </w:rPr>
-        <w:t>Bảng 8. Kết quả kiểm chứng: 337 phép kiểm, 0 thất bại (results/huim_zone/verification.json)</w:t>
+        <w:t>Bảng 8. Kết quả kiểm chứng: 402 phép kiểm, 0 thất bại (results/huim_zone/verification.json)</w:t>
       </w:r>
     </w:p>
     <w:tbl>
@@ -8412,6 +8686,53 @@
                 <w:rFonts w:ascii="Times New Roman" w:hAnsi="Times New Roman" w:eastAsia="Times New Roman" w:cs="Times New Roman"/>
               </w:rPr>
               <w:t>DLULIB</w:t>
+            </w:r>
+          </w:p>
+        </w:tc>
+        <w:tc>
+          <w:tcPr>
+            <w:tcW w:type="dxa" w:w="3120"/>
+          </w:tcPr>
+          <w:p>
+            <w:r/>
+            <w:r>
+              <w:rPr>
+                <w:sz w:val="18"/>
+                <w:rFonts w:ascii="Times New Roman" w:hAnsi="Times New Roman" w:eastAsia="Times New Roman" w:cs="Times New Roman"/>
+              </w:rPr>
+              <w:t>65</w:t>
+            </w:r>
+          </w:p>
+        </w:tc>
+        <w:tc>
+          <w:tcPr>
+            <w:tcW w:type="dxa" w:w="3120"/>
+          </w:tcPr>
+          <w:p>
+            <w:r/>
+            <w:r>
+              <w:rPr>
+                <w:sz w:val="18"/>
+                <w:rFonts w:ascii="Times New Roman" w:hAnsi="Times New Roman" w:eastAsia="Times New Roman" w:cs="Times New Roman"/>
+              </w:rPr>
+              <w:t>0</w:t>
+            </w:r>
+          </w:p>
+        </w:tc>
+      </w:tr>
+      <w:tr>
+        <w:tc>
+          <w:tcPr>
+            <w:tcW w:type="dxa" w:w="3120"/>
+          </w:tcPr>
+          <w:p>
+            <w:r/>
+            <w:r>
+              <w:rPr>
+                <w:sz w:val="18"/>
+                <w:rFonts w:ascii="Times New Roman" w:hAnsi="Times New Roman" w:eastAsia="Times New Roman" w:cs="Times New Roman"/>
+              </w:rPr>
+              <w:t>HCXY</w:t>
             </w:r>
           </w:p>
         </w:tc>

</xml_diff>